<commit_message>
Explain floor-plan auto-seat-placement and diary-to-report link
Adds a dedicated subsection for uploading a real floor-plan photo and
letting AI auto-detect seats (previously just a one-line tip), and
explains that a student's generated link opens their personal study
diary (index.html) whose daily plan/checklist entries, together with
tablet attendance data, are what the director/parent-facing daily,
weekly, and monthly reports are built from -- including where to view
those reports from the admin side.

Co-Authored-By: Claude Sonnet 5 <noreply@anthropic.com>
Claude-Session: https://claude.ai/code/session_01GVtw2NSZuYwccbbdMyoHta
</commit_message>
<xml_diff>
--- a/docs/플래니360_사용설명서.docx
+++ b/docs/플래니360_사용설명서.docx
@@ -965,7 +965,7 @@
                 <w:sz w:val="21"/>
                 <w:szCs w:val="21"/>
               </w:rPr>
-              <w:t xml:space="preserve">좌석을 하나씩 추가하려면 [+ 좌석 추가] 버튼을, 자리 위치를 손으로 옮기려면 [✏️ 배치 편집] 버튼을 사용하세요. 이미 실제 독서실 도면(사진)이 있다면 [도면 업로드]로 사진을 올려 자동으로 좌석을 배치할 수도 있습니다.</w:t>
+              <w:t xml:space="preserve">좌석을 하나씩 추가하려면 [+ 좌석 추가] 버튼을, 자리 위치를 손으로 옮기려면 [✏️ 배치 편집] 버튼을 사용하세요.</w:t>
             </w:r>
           </w:p>
         </w:tc>
@@ -973,8 +973,105 @@
     </w:tbl>
     <w:p>
       <w:pPr>
-        <w:spacing w:after="160"/>
-      </w:pPr>
+        <w:pStyle w:val="Heading2"/>
+        <w:spacing w:after="120" w:before="300"/>
+      </w:pPr>
+      <w:r>
+        <w:rPr>
+          <w:rFonts w:ascii="Malgun Gothic" w:cs="Malgun Gothic" w:eastAsia="Malgun Gothic" w:hAnsi="Malgun Gothic"/>
+          <w:b/>
+          <w:bCs/>
+          <w:color w:val="1F3B57"/>
+          <w:sz w:val="24"/>
+          <w:szCs w:val="24"/>
+        </w:rPr>
+        <w:t xml:space="preserve">3) (선택) 실제 도면 사진으로 자동 배치하기 — 더 정확하게 만들고 싶다면</w:t>
+      </w:r>
+    </w:p>
+    <w:p>
+      <w:pPr>
+        <w:spacing w:after="140" w:line="300"/>
+      </w:pPr>
+      <w:r>
+        <w:rPr>
+          <w:rFonts w:ascii="Malgun Gothic" w:cs="Malgun Gothic" w:eastAsia="Malgun Gothic" w:hAnsi="Malgun Gothic"/>
+          <w:sz w:val="22"/>
+          <w:szCs w:val="22"/>
+        </w:rPr>
+        <w:t xml:space="preserve">우리 독서실의 실제 배치도(사진이나 스캔한 도면)가 있다면, 격자로 대충 만드는 대신 사진을 그대로 올려서 실제 모양과 똑같이 좌석을 자동으로 만들 수 있습니다.</w:t>
+      </w:r>
+    </w:p>
+    <w:p>
+      <w:pPr>
+        <w:pStyle w:val="ListParagraph"/>
+        <w:numPr>
+          <w:ilvl w:val="0"/>
+          <w:numId w:val="2"/>
+        </w:numPr>
+        <w:spacing w:after="120" w:line="300"/>
+      </w:pPr>
+      <w:r>
+        <w:rPr>
+          <w:rFonts w:ascii="Malgun Gothic" w:cs="Malgun Gothic" w:eastAsia="Malgun Gothic" w:hAnsi="Malgun Gothic"/>
+          <w:sz w:val="22"/>
+          <w:szCs w:val="22"/>
+        </w:rPr>
+        <w:t xml:space="preserve">[🖼️ 도면 업로드] 버튼을 클릭해 독서실 배치도 사진(또는 스캔 파일)을 선택합니다.</w:t>
+      </w:r>
+    </w:p>
+    <w:p>
+      <w:pPr>
+        <w:pStyle w:val="ListParagraph"/>
+        <w:numPr>
+          <w:ilvl w:val="0"/>
+          <w:numId w:val="2"/>
+        </w:numPr>
+        <w:spacing w:after="120" w:line="300"/>
+      </w:pPr>
+      <w:r>
+        <w:rPr>
+          <w:rFonts w:ascii="Malgun Gothic" w:cs="Malgun Gothic" w:eastAsia="Malgun Gothic" w:hAnsi="Malgun Gothic"/>
+          <w:sz w:val="22"/>
+          <w:szCs w:val="22"/>
+        </w:rPr>
+        <w:t xml:space="preserve">사진이 올라가면 AI가 자동으로 사진 속 책상 위치를 인식해서 좌석을 바로 만들어줍니다. (별도 버튼을 누르지 않아도 자동으로 실행됩니다.)</w:t>
+      </w:r>
+    </w:p>
+    <w:p>
+      <w:pPr>
+        <w:pStyle w:val="ListParagraph"/>
+        <w:numPr>
+          <w:ilvl w:val="0"/>
+          <w:numId w:val="2"/>
+        </w:numPr>
+        <w:spacing w:after="120" w:line="300"/>
+      </w:pPr>
+      <w:r>
+        <w:rPr>
+          <w:rFonts w:ascii="Malgun Gothic" w:cs="Malgun Gothic" w:eastAsia="Malgun Gothic" w:hAnsi="Malgun Gothic"/>
+          <w:sz w:val="22"/>
+          <w:szCs w:val="22"/>
+        </w:rPr>
+        <w:t xml:space="preserve">화면에 배치된 좌석 중 위치가 어긋난 것이 있으면, 손가락(또는 마우스)으로 드래그해서 실제 자리에 맞게 옮겨줍니다.</w:t>
+      </w:r>
+    </w:p>
+    <w:p>
+      <w:pPr>
+        <w:pStyle w:val="ListParagraph"/>
+        <w:numPr>
+          <w:ilvl w:val="0"/>
+          <w:numId w:val="2"/>
+        </w:numPr>
+        <w:spacing w:after="120" w:line="300"/>
+      </w:pPr>
+      <w:r>
+        <w:rPr>
+          <w:rFonts w:ascii="Malgun Gothic" w:cs="Malgun Gothic" w:eastAsia="Malgun Gothic" w:hAnsi="Malgun Gothic"/>
+          <w:sz w:val="22"/>
+          <w:szCs w:val="22"/>
+        </w:rPr>
+        <w:t xml:space="preserve">인식이 덜 됐거나 좌석이 더 있다면 [🪄 도면에서 자동 배치] 버튼을 다시 눌러 추가로 인식시킬 수 있습니다.</w:t>
+      </w:r>
     </w:p>
     <w:tbl>
       <w:tblPr>
@@ -996,12 +1093,12 @@
           <w:tcPr>
             <w:tcW w:type="dxa" w:w="9000"/>
             <w:tcBorders>
-              <w:top w:val="single" w:color="E08787" w:sz="8"/>
-              <w:left w:val="single" w:color="E08787" w:sz="8"/>
-              <w:bottom w:val="single" w:color="E08787" w:sz="8"/>
-              <w:right w:val="single" w:color="E08787" w:sz="8"/>
+              <w:top w:val="single" w:color="E8C660" w:sz="8"/>
+              <w:left w:val="single" w:color="E8C660" w:sz="8"/>
+              <w:bottom w:val="single" w:color="E8C660" w:sz="8"/>
+              <w:right w:val="single" w:color="E8C660" w:sz="8"/>
             </w:tcBorders>
-            <w:shd w:fill="FDE8E8" w:color="auto" w:val="clear"/>
+            <w:shd w:fill="FFF6D9" w:color="auto" w:val="clear"/>
             <w:tcMar>
               <w:top w:type="dxa" w:w="140"/>
               <w:left w:type="dxa" w:w="180"/>
@@ -1022,7 +1119,7 @@
                 <w:sz w:val="21"/>
                 <w:szCs w:val="21"/>
               </w:rPr>
-              <w:t xml:space="preserve">⚠️ 주의</w:t>
+              <w:t xml:space="preserve">💡 TIP</w:t>
             </w:r>
           </w:p>
           <w:p>
@@ -1035,239 +1132,16 @@
                 <w:sz w:val="21"/>
                 <w:szCs w:val="21"/>
               </w:rPr>
-              <w:t xml:space="preserve">좌석을 하나도 만들지 않으면, 학생들이 사용할 출석 체크 태블릿 화면에 "등록된 좌석이 없어요"라는 안내만 뜨고 사용이 되지 않습니다. 반드시 좌석을 먼저 만들어 주세요.</w:t>
+              <w:t xml:space="preserve">AI 자동 인식은 완벽하지 않을 수 있어요. 특히 독서실이 넓고 좌석이 많으면 한 번에 다 못 찾을 수 있으니, 배치 후 꼭 눈으로 확인하고 드래그로 조정해 주세요. 도면이 복잡할 때는 일부 구역만 선택해서 나눠 분석하는 기능도 있으니, 잘 안 될 경우 담당자에게 문의해 주세요. 도면을 다시 올리고 싶으면 [🗑️ 도면 삭제]로 지운 뒤 새 사진을 올리면 됩니다 (이미 만든 좌석은 지워지지 않습니다).</w:t>
             </w:r>
           </w:p>
         </w:tc>
       </w:tr>
     </w:tbl>
     <w:p>
-      <w:r>
-        <w:br w:type="page"/>
-      </w:r>
-    </w:p>
-    <w:p>
-      <w:pPr>
-        <w:pStyle w:val="Heading1"/>
-        <w:pBdr>
-          <w:bottom w:val="single" w:color="1F3B57" w:sz="12" w:space="4"/>
-        </w:pBdr>
-        <w:spacing w:after="200" w:before="480"/>
-      </w:pPr>
-      <w:r>
-        <w:rPr>
-          <w:rFonts w:ascii="Malgun Gothic" w:cs="Malgun Gothic" w:eastAsia="Malgun Gothic" w:hAnsi="Malgun Gothic"/>
-          <w:b/>
-          <w:bCs/>
-          <w:color w:val="2E6BB4"/>
-          <w:sz w:val="30"/>
-          <w:szCs w:val="30"/>
-        </w:rPr>
-        <w:t xml:space="preserve">2단계.  </w:t>
-      </w:r>
-      <w:r>
-        <w:rPr>
-          <w:rFonts w:ascii="Malgun Gothic" w:cs="Malgun Gothic" w:eastAsia="Malgun Gothic" w:hAnsi="Malgun Gothic"/>
-          <w:b/>
-          <w:bCs/>
-          <w:color w:val="1F3B57"/>
-          <w:sz w:val="30"/>
-          <w:szCs w:val="30"/>
-        </w:rPr>
-        <w:t xml:space="preserve">학생 등록하고 링크 만들기</w:t>
-      </w:r>
-    </w:p>
-    <w:p>
-      <w:pPr>
-        <w:spacing w:after="140" w:line="300"/>
-      </w:pPr>
-      <w:r>
-        <w:rPr>
-          <w:rFonts w:ascii="Malgun Gothic" w:cs="Malgun Gothic" w:eastAsia="Malgun Gothic" w:hAnsi="Malgun Gothic"/>
-          <w:sz w:val="22"/>
-          <w:szCs w:val="22"/>
-        </w:rPr>
-        <w:t xml:space="preserve">학생마다 개인 전용 '학습 플래너 링크'를 만들어주는 단계입니다. 이 링크를 학생에게 보내주면, 학생은 그 링크로 본인의 학습 계획표와 출석 기록을 사용하게 됩니다. 이 작업은 학생이 새로 들어올 때마다 한 번씩 해주시면 됩니다.</w:t>
-      </w:r>
-    </w:p>
-    <w:p>
-      <w:pPr>
-        <w:pStyle w:val="Heading2"/>
-        <w:spacing w:after="120" w:before="300"/>
-      </w:pPr>
-      <w:r>
-        <w:rPr>
-          <w:rFonts w:ascii="Malgun Gothic" w:cs="Malgun Gothic" w:eastAsia="Malgun Gothic" w:hAnsi="Malgun Gothic"/>
-          <w:b/>
-          <w:bCs/>
-          <w:color w:val="1F3B57"/>
-          <w:sz w:val="24"/>
-          <w:szCs w:val="24"/>
-        </w:rPr>
-        <w:t xml:space="preserve">학생 링크 만드는 순서</w:t>
-      </w:r>
-    </w:p>
-    <w:p>
-      <w:pPr>
-        <w:pStyle w:val="ListParagraph"/>
-        <w:numPr>
-          <w:ilvl w:val="0"/>
-          <w:numId w:val="2"/>
-        </w:numPr>
-        <w:spacing w:after="120" w:line="300"/>
-      </w:pPr>
-      <w:r>
-        <w:rPr>
-          <w:rFonts w:ascii="Malgun Gothic" w:cs="Malgun Gothic" w:eastAsia="Malgun Gothic" w:hAnsi="Malgun Gothic"/>
-          <w:sz w:val="22"/>
-          <w:szCs w:val="22"/>
-        </w:rPr>
-        <w:t xml:space="preserve">위쪽 메뉴에서 [학생관리] 탭을 클릭합니다. (플래니 360°에 들어가면 기본으로 열려있는 화면입니다.)</w:t>
-      </w:r>
-    </w:p>
-    <w:p>
-      <w:pPr>
-        <w:pStyle w:val="ListParagraph"/>
-        <w:numPr>
-          <w:ilvl w:val="0"/>
-          <w:numId w:val="2"/>
-        </w:numPr>
-        <w:spacing w:after="120" w:line="300"/>
-      </w:pPr>
-      <w:r>
-        <w:rPr>
-          <w:rFonts w:ascii="Malgun Gothic" w:cs="Malgun Gothic" w:eastAsia="Malgun Gothic" w:hAnsi="Malgun Gothic"/>
-          <w:sz w:val="22"/>
-          <w:szCs w:val="22"/>
-        </w:rPr>
-        <w:t xml:space="preserve">학생 이름을 입력합니다.</w:t>
-      </w:r>
-    </w:p>
-    <w:p>
-      <w:pPr>
-        <w:pStyle w:val="ListParagraph"/>
-        <w:numPr>
-          <w:ilvl w:val="0"/>
-          <w:numId w:val="2"/>
-        </w:numPr>
-        <w:spacing w:after="120" w:line="300"/>
-      </w:pPr>
-      <w:r>
-        <w:rPr>
-          <w:rFonts w:ascii="Malgun Gothic" w:cs="Malgun Gothic" w:eastAsia="Malgun Gothic" w:hAnsi="Malgun Gothic"/>
-          <w:sz w:val="22"/>
-          <w:szCs w:val="22"/>
-        </w:rPr>
-        <w:t xml:space="preserve">학교 이름을 입력해서 검색되는 목록 중 학생의 학교를 클릭해서 선택합니다.</w:t>
-      </w:r>
-    </w:p>
-    <w:p>
-      <w:pPr>
-        <w:pStyle w:val="ListParagraph"/>
-        <w:numPr>
-          <w:ilvl w:val="0"/>
-          <w:numId w:val="2"/>
-        </w:numPr>
-        <w:spacing w:after="120" w:line="300"/>
-      </w:pPr>
-      <w:r>
-        <w:rPr>
-          <w:rFonts w:ascii="Malgun Gothic" w:cs="Malgun Gothic" w:eastAsia="Malgun Gothic" w:hAnsi="Malgun Gothic"/>
-          <w:sz w:val="22"/>
-          <w:szCs w:val="22"/>
-        </w:rPr>
-        <w:t xml:space="preserve">학년을 선택합니다.</w:t>
-      </w:r>
-    </w:p>
-    <w:p>
-      <w:pPr>
-        <w:pStyle w:val="ListParagraph"/>
-        <w:numPr>
-          <w:ilvl w:val="0"/>
-          <w:numId w:val="2"/>
-        </w:numPr>
-        <w:spacing w:after="120" w:line="300"/>
-      </w:pPr>
-      <w:r>
-        <w:rPr>
-          <w:rFonts w:ascii="Malgun Gothic" w:cs="Malgun Gothic" w:eastAsia="Malgun Gothic" w:hAnsi="Malgun Gothic"/>
-          <w:sz w:val="22"/>
-          <w:szCs w:val="22"/>
-        </w:rPr>
-        <w:t xml:space="preserve">(선택) 학생 휴대폰 번호를 입력합니다. 뒷자리 4자리가 출석 체크용 비밀번호로 자동으로 사용됩니다.</w:t>
-      </w:r>
-    </w:p>
-    <w:p>
-      <w:pPr>
-        <w:pStyle w:val="ListParagraph"/>
-        <w:numPr>
-          <w:ilvl w:val="0"/>
-          <w:numId w:val="2"/>
-        </w:numPr>
-        <w:spacing w:after="120" w:line="300"/>
-      </w:pPr>
-      <w:r>
-        <w:rPr>
-          <w:rFonts w:ascii="Malgun Gothic" w:cs="Malgun Gothic" w:eastAsia="Malgun Gothic" w:hAnsi="Malgun Gothic"/>
-          <w:sz w:val="22"/>
-          <w:szCs w:val="22"/>
-        </w:rPr>
-        <w:t xml:space="preserve">(선택) 학부모 연락처를 입력하면 카카오톡/문자 알림을 보낼 수 있습니다.</w:t>
-      </w:r>
-    </w:p>
-    <w:p>
-      <w:pPr>
-        <w:pStyle w:val="ListParagraph"/>
-        <w:numPr>
-          <w:ilvl w:val="0"/>
-          <w:numId w:val="2"/>
-        </w:numPr>
-        <w:spacing w:after="120" w:line="300"/>
-      </w:pPr>
-      <w:r>
-        <w:rPr>
-          <w:rFonts w:ascii="Malgun Gothic" w:cs="Malgun Gothic" w:eastAsia="Malgun Gothic" w:hAnsi="Malgun Gothic"/>
-          <w:sz w:val="22"/>
-          <w:szCs w:val="22"/>
-        </w:rPr>
-        <w:t xml:space="preserve">(선택) 배정 독서실에서, 1단계에서 만들어둔 독서실을 선택합니다. 정하지 않아도 됩니다.</w:t>
-      </w:r>
-    </w:p>
-    <w:p>
-      <w:pPr>
-        <w:pStyle w:val="ListParagraph"/>
-        <w:numPr>
-          <w:ilvl w:val="0"/>
-          <w:numId w:val="2"/>
-        </w:numPr>
-        <w:spacing w:after="120" w:line="300"/>
-      </w:pPr>
-      <w:r>
-        <w:rPr>
-          <w:rFonts w:ascii="Malgun Gothic" w:cs="Malgun Gothic" w:eastAsia="Malgun Gothic" w:hAnsi="Malgun Gothic"/>
-          <w:sz w:val="22"/>
-          <w:szCs w:val="22"/>
-        </w:rPr>
-        <w:t xml:space="preserve">[링크 생성] 버튼을 클릭합니다.</w:t>
-      </w:r>
-    </w:p>
-    <w:p>
-      <w:pPr>
-        <w:pStyle w:val="ListParagraph"/>
-        <w:numPr>
-          <w:ilvl w:val="0"/>
-          <w:numId w:val="2"/>
-        </w:numPr>
-        <w:spacing w:after="120" w:line="300"/>
-      </w:pPr>
-      <w:r>
-        <w:rPr>
-          <w:rFonts w:ascii="Malgun Gothic" w:cs="Malgun Gothic" w:eastAsia="Malgun Gothic" w:hAnsi="Malgun Gothic"/>
-          <w:sz w:val="22"/>
-          <w:szCs w:val="22"/>
-        </w:rPr>
-        <w:t xml:space="preserve">만들어진 링크 옆의 [복사] 버튼이나 [카카오톡 공유] 버튼을 눌러 학생(또는 학부모)에게 바로 전달합니다.</w:t>
-      </w:r>
+      <w:pPr>
+        <w:spacing w:after="160"/>
+      </w:pPr>
     </w:p>
     <w:tbl>
       <w:tblPr>
@@ -1289,12 +1163,12 @@
           <w:tcPr>
             <w:tcW w:type="dxa" w:w="9000"/>
             <w:tcBorders>
-              <w:top w:val="single" w:color="E8C660" w:sz="8"/>
-              <w:left w:val="single" w:color="E8C660" w:sz="8"/>
-              <w:bottom w:val="single" w:color="E8C660" w:sz="8"/>
-              <w:right w:val="single" w:color="E8C660" w:sz="8"/>
+              <w:top w:val="single" w:color="E08787" w:sz="8"/>
+              <w:left w:val="single" w:color="E08787" w:sz="8"/>
+              <w:bottom w:val="single" w:color="E08787" w:sz="8"/>
+              <w:right w:val="single" w:color="E08787" w:sz="8"/>
             </w:tcBorders>
-            <w:shd w:fill="FFF6D9" w:color="auto" w:val="clear"/>
+            <w:shd w:fill="FDE8E8" w:color="auto" w:val="clear"/>
             <w:tcMar>
               <w:top w:type="dxa" w:w="140"/>
               <w:left w:type="dxa" w:w="180"/>
@@ -1315,7 +1189,7 @@
                 <w:sz w:val="21"/>
                 <w:szCs w:val="21"/>
               </w:rPr>
-              <w:t xml:space="preserve">💡 TIP</w:t>
+              <w:t xml:space="preserve">⚠️ 주의</w:t>
             </w:r>
           </w:p>
           <w:p>
@@ -1328,30 +1202,12 @@
                 <w:sz w:val="21"/>
                 <w:szCs w:val="21"/>
               </w:rPr>
-              <w:t xml:space="preserve">휴대폰 번호와 배정 독서실은 꼭 입력하지 않아도 링크는 만들어집니다. 다만 출석 체크(태블릿)를 사용하시려면 휴대폰 번호(출석 비밀번호용)를 입력해두시는 것을 권장합니다.</w:t>
+              <w:t xml:space="preserve">좌석을 하나도 만들지 않으면, 학생들이 사용할 출석 체크 태블릿 화면에 "등록된 좌석이 없어요"라는 안내만 뜨고 사용이 되지 않습니다. 반드시 좌석을 먼저 만들어 주세요.</w:t>
             </w:r>
           </w:p>
         </w:tc>
       </w:tr>
     </w:tbl>
-    <w:p>
-      <w:pPr>
-        <w:spacing w:after="160"/>
-      </w:pPr>
-    </w:p>
-    <w:p>
-      <w:pPr>
-        <w:spacing w:after="140" w:line="300"/>
-      </w:pPr>
-      <w:r>
-        <w:rPr>
-          <w:rFonts w:ascii="Malgun Gothic" w:cs="Malgun Gothic" w:eastAsia="Malgun Gothic" w:hAnsi="Malgun Gothic"/>
-          <w:sz w:val="22"/>
-          <w:szCs w:val="22"/>
-        </w:rPr>
-        <w:t xml:space="preserve">등록한 학생 목록은 [학생관리] 화면 아래쪽에서 전체 / 배정 / 미배정으로 나누어 확인할 수 있습니다.</w:t>
-      </w:r>
-    </w:p>
     <w:p>
       <w:r>
         <w:br w:type="page"/>
@@ -1374,7 +1230,7 @@
           <w:sz w:val="30"/>
           <w:szCs w:val="30"/>
         </w:rPr>
-        <w:t xml:space="preserve">3단계.  </w:t>
+        <w:t xml:space="preserve">2단계.  </w:t>
       </w:r>
       <w:r>
         <w:rPr>
@@ -1385,7 +1241,7 @@
           <w:sz w:val="30"/>
           <w:szCs w:val="30"/>
         </w:rPr>
-        <w:t xml:space="preserve">기본 설정 확인하기</w:t>
+        <w:t xml:space="preserve">학생 등록하고 링크 만들기</w:t>
       </w:r>
     </w:p>
     <w:p>
@@ -1398,7 +1254,24 @@
           <w:sz w:val="22"/>
           <w:szCs w:val="22"/>
         </w:rPr>
-        <w:t xml:space="preserve">[설정] 탭에서 학원의 기본 운영 방식을 정합니다. 한 번만 정해두면 계속 유지됩니다.</w:t>
+        <w:t xml:space="preserve">학생마다 개인 전용 '학습 플래너 링크'를 만들어주는 단계입니다. 이 링크를 학생에게 보내주면, 학생은 그 링크로 본인의 학습 계획표와 출석 기록을 사용하게 됩니다. 이 작업은 학생이 새로 들어올 때마다 한 번씩 해주시면 됩니다.</w:t>
+      </w:r>
+    </w:p>
+    <w:p>
+      <w:pPr>
+        <w:pStyle w:val="Heading2"/>
+        <w:spacing w:after="120" w:before="300"/>
+      </w:pPr>
+      <w:r>
+        <w:rPr>
+          <w:rFonts w:ascii="Malgun Gothic" w:cs="Malgun Gothic" w:eastAsia="Malgun Gothic" w:hAnsi="Malgun Gothic"/>
+          <w:b/>
+          <w:bCs/>
+          <w:color w:val="1F3B57"/>
+          <w:sz w:val="24"/>
+          <w:szCs w:val="24"/>
+        </w:rPr>
+        <w:t xml:space="preserve">학생 링크 만드는 순서</w:t>
       </w:r>
     </w:p>
     <w:p>
@@ -1416,7 +1289,7 @@
           <w:sz w:val="22"/>
           <w:szCs w:val="22"/>
         </w:rPr>
-        <w:t xml:space="preserve">위쪽 메뉴에서 [설정] 탭을 클릭합니다.</w:t>
+        <w:t xml:space="preserve">위쪽 메뉴에서 [학생관리] 탭을 클릭합니다. (플래니 360°에 들어가면 기본으로 열려있는 화면입니다.)</w:t>
       </w:r>
     </w:p>
     <w:p>
@@ -1434,7 +1307,7 @@
           <w:sz w:val="22"/>
           <w:szCs w:val="22"/>
         </w:rPr>
-        <w:t xml:space="preserve">학원(독서실) 이름을 입력하거나 확인합니다.</w:t>
+        <w:t xml:space="preserve">학생 이름을 입력합니다.</w:t>
       </w:r>
     </w:p>
     <w:p>
@@ -1452,7 +1325,7 @@
           <w:sz w:val="22"/>
           <w:szCs w:val="22"/>
         </w:rPr>
-        <w:t xml:space="preserve">자리 배정 방식을 정합니다. [자유석]은 학생이 빈자리 아무데나 앉는 방식이고, [지정자석]은 학생마다 고정된 자리를 정해주는 방식입니다. 처음에는 [자유석]을 추천합니다.</w:t>
+        <w:t xml:space="preserve">학교 이름을 입력해서 검색되는 목록 중 학생의 학교를 클릭해서 선택합니다.</w:t>
       </w:r>
     </w:p>
     <w:p>
@@ -1470,7 +1343,7 @@
           <w:sz w:val="22"/>
           <w:szCs w:val="22"/>
         </w:rPr>
-        <w:t xml:space="preserve">학부모 알림(카카오톡 또는 문자)을 사용하실 경우 관련 정보를 입력합니다. 필요 없으면 비워두어도 됩니다.</w:t>
+        <w:t xml:space="preserve">학년을 선택합니다.</w:t>
       </w:r>
     </w:p>
     <w:p>
@@ -1488,7 +1361,79 @@
           <w:sz w:val="22"/>
           <w:szCs w:val="22"/>
         </w:rPr>
-        <w:t xml:space="preserve">태블릿 종료용 4자리 비밀번호를 반드시 설정합니다.</w:t>
+        <w:t xml:space="preserve">(선택) 학생 휴대폰 번호를 입력합니다. 뒷자리 4자리가 출석 체크용 비밀번호로 자동으로 사용됩니다.</w:t>
+      </w:r>
+    </w:p>
+    <w:p>
+      <w:pPr>
+        <w:pStyle w:val="ListParagraph"/>
+        <w:numPr>
+          <w:ilvl w:val="0"/>
+          <w:numId w:val="2"/>
+        </w:numPr>
+        <w:spacing w:after="120" w:line="300"/>
+      </w:pPr>
+      <w:r>
+        <w:rPr>
+          <w:rFonts w:ascii="Malgun Gothic" w:cs="Malgun Gothic" w:eastAsia="Malgun Gothic" w:hAnsi="Malgun Gothic"/>
+          <w:sz w:val="22"/>
+          <w:szCs w:val="22"/>
+        </w:rPr>
+        <w:t xml:space="preserve">(선택) 학부모 연락처를 입력하면 카카오톡/문자 알림을 보낼 수 있습니다.</w:t>
+      </w:r>
+    </w:p>
+    <w:p>
+      <w:pPr>
+        <w:pStyle w:val="ListParagraph"/>
+        <w:numPr>
+          <w:ilvl w:val="0"/>
+          <w:numId w:val="2"/>
+        </w:numPr>
+        <w:spacing w:after="120" w:line="300"/>
+      </w:pPr>
+      <w:r>
+        <w:rPr>
+          <w:rFonts w:ascii="Malgun Gothic" w:cs="Malgun Gothic" w:eastAsia="Malgun Gothic" w:hAnsi="Malgun Gothic"/>
+          <w:sz w:val="22"/>
+          <w:szCs w:val="22"/>
+        </w:rPr>
+        <w:t xml:space="preserve">(선택) 배정 독서실에서, 1단계에서 만들어둔 독서실을 선택합니다. 정하지 않아도 됩니다.</w:t>
+      </w:r>
+    </w:p>
+    <w:p>
+      <w:pPr>
+        <w:pStyle w:val="ListParagraph"/>
+        <w:numPr>
+          <w:ilvl w:val="0"/>
+          <w:numId w:val="2"/>
+        </w:numPr>
+        <w:spacing w:after="120" w:line="300"/>
+      </w:pPr>
+      <w:r>
+        <w:rPr>
+          <w:rFonts w:ascii="Malgun Gothic" w:cs="Malgun Gothic" w:eastAsia="Malgun Gothic" w:hAnsi="Malgun Gothic"/>
+          <w:sz w:val="22"/>
+          <w:szCs w:val="22"/>
+        </w:rPr>
+        <w:t xml:space="preserve">[링크 생성] 버튼을 클릭합니다.</w:t>
+      </w:r>
+    </w:p>
+    <w:p>
+      <w:pPr>
+        <w:pStyle w:val="ListParagraph"/>
+        <w:numPr>
+          <w:ilvl w:val="0"/>
+          <w:numId w:val="2"/>
+        </w:numPr>
+        <w:spacing w:after="120" w:line="300"/>
+      </w:pPr>
+      <w:r>
+        <w:rPr>
+          <w:rFonts w:ascii="Malgun Gothic" w:cs="Malgun Gothic" w:eastAsia="Malgun Gothic" w:hAnsi="Malgun Gothic"/>
+          <w:sz w:val="22"/>
+          <w:szCs w:val="22"/>
+        </w:rPr>
+        <w:t xml:space="preserve">만들어진 링크 옆의 [복사] 버튼이나 [카카오톡 공유] 버튼을 눌러 학생(또는 학부모)에게 바로 전달합니다.</w:t>
       </w:r>
     </w:p>
     <w:tbl>
@@ -1511,12 +1456,12 @@
           <w:tcPr>
             <w:tcW w:type="dxa" w:w="9000"/>
             <w:tcBorders>
-              <w:top w:val="single" w:color="E08787" w:sz="8"/>
-              <w:left w:val="single" w:color="E08787" w:sz="8"/>
-              <w:bottom w:val="single" w:color="E08787" w:sz="8"/>
-              <w:right w:val="single" w:color="E08787" w:sz="8"/>
+              <w:top w:val="single" w:color="E8C660" w:sz="8"/>
+              <w:left w:val="single" w:color="E8C660" w:sz="8"/>
+              <w:bottom w:val="single" w:color="E8C660" w:sz="8"/>
+              <w:right w:val="single" w:color="E8C660" w:sz="8"/>
             </w:tcBorders>
-            <w:shd w:fill="FDE8E8" w:color="auto" w:val="clear"/>
+            <w:shd w:fill="FFF6D9" w:color="auto" w:val="clear"/>
             <w:tcMar>
               <w:top w:type="dxa" w:w="140"/>
               <w:left w:type="dxa" w:w="180"/>
@@ -1537,7 +1482,7 @@
                 <w:sz w:val="21"/>
                 <w:szCs w:val="21"/>
               </w:rPr>
-              <w:t xml:space="preserve">⚠️ 주의 — 태블릿 비밀번호를 꼭 설정하세요</w:t>
+              <w:t xml:space="preserve">💡 TIP</w:t>
             </w:r>
           </w:p>
           <w:p>
@@ -1550,46 +1495,50 @@
                 <w:sz w:val="21"/>
                 <w:szCs w:val="21"/>
               </w:rPr>
-              <w:t xml:space="preserve">학생 출석 체크용 태블릿 화면은 학생들이 실수로 관리자 화면으로 넘어가지 못하도록 4자리 비밀번호로 잠겨 있습니다. 이 비밀번호를 미리 정해두지 않으면 나중에 태블릿에서 빠져나오기 곤란할 수 있으니, 꼭 기억하기 쉬운 번호로 설정해 두세요.</w:t>
+              <w:t xml:space="preserve">휴대폰 번호와 배정 독서실은 꼭 입력하지 않아도 링크는 만들어집니다. 다만 출석 체크(태블릿)를 사용하시려면 휴대폰 번호(출석 비밀번호용)를 입력해두시는 것을 권장합니다.</w:t>
             </w:r>
           </w:p>
         </w:tc>
       </w:tr>
     </w:tbl>
     <w:p>
-      <w:r>
-        <w:br w:type="page"/>
-      </w:r>
-    </w:p>
-    <w:p>
-      <w:pPr>
-        <w:pStyle w:val="Heading1"/>
-        <w:pBdr>
-          <w:bottom w:val="single" w:color="1F3B57" w:sz="12" w:space="4"/>
-        </w:pBdr>
-        <w:spacing w:after="200" w:before="480"/>
-      </w:pPr>
-      <w:r>
-        <w:rPr>
-          <w:rFonts w:ascii="Malgun Gothic" w:cs="Malgun Gothic" w:eastAsia="Malgun Gothic" w:hAnsi="Malgun Gothic"/>
-          <w:b/>
-          <w:bCs/>
-          <w:color w:val="2E6BB4"/>
-          <w:sz w:val="30"/>
-          <w:szCs w:val="30"/>
-        </w:rPr>
-        <w:t xml:space="preserve">4단계.  </w:t>
-      </w:r>
+      <w:pPr>
+        <w:spacing w:after="160"/>
+      </w:pPr>
+    </w:p>
+    <w:p>
+      <w:pPr>
+        <w:spacing w:after="140" w:line="300"/>
+      </w:pPr>
+      <w:r>
+        <w:rPr>
+          <w:rFonts w:ascii="Malgun Gothic" w:cs="Malgun Gothic" w:eastAsia="Malgun Gothic" w:hAnsi="Malgun Gothic"/>
+          <w:sz w:val="22"/>
+          <w:szCs w:val="22"/>
+        </w:rPr>
+        <w:t xml:space="preserve">등록한 학생 목록은 [학생관리] 화면 아래쪽에서 전체 / 배정 / 미배정으로 나누어 확인할 수 있습니다.</w:t>
+      </w:r>
+    </w:p>
+    <w:p>
+      <w:pPr>
+        <w:spacing w:after="200"/>
+      </w:pPr>
+    </w:p>
+    <w:p>
+      <w:pPr>
+        <w:pStyle w:val="Heading2"/>
+        <w:spacing w:after="120" w:before="300"/>
+      </w:pPr>
       <w:r>
         <w:rPr>
           <w:rFonts w:ascii="Malgun Gothic" w:cs="Malgun Gothic" w:eastAsia="Malgun Gothic" w:hAnsi="Malgun Gothic"/>
           <w:b/>
           <w:bCs/>
           <w:color w:val="1F3B57"/>
-          <w:sz w:val="30"/>
-          <w:szCs w:val="30"/>
-        </w:rPr>
-        <w:t xml:space="preserve">태블릿으로 학생 출석 체크하기</w:t>
+          <w:sz w:val="24"/>
+          <w:szCs w:val="24"/>
+        </w:rPr>
+        <w:t xml:space="preserve">이 링크는 단순 출입증이 아니라, 학생의 '학습 다이어리'입니다</w:t>
       </w:r>
     </w:p>
     <w:p>
@@ -1602,97 +1551,20 @@
           <w:sz w:val="22"/>
           <w:szCs w:val="22"/>
         </w:rPr>
-        <w:t xml:space="preserve">독서실 입구나 책상에 놓아둘 태블릿(또는 여분 컴퓨터)에서 사용하는 화면입니다. 1~3단계를 먼저 마친 뒤에 사용해 주세요.</w:t>
-      </w:r>
-    </w:p>
-    <w:p>
-      <w:pPr>
-        <w:pStyle w:val="ListParagraph"/>
-        <w:numPr>
-          <w:ilvl w:val="0"/>
-          <w:numId w:val="2"/>
-        </w:numPr>
-        <w:spacing w:after="120" w:line="300"/>
-      </w:pPr>
-      <w:r>
-        <w:rPr>
-          <w:rFonts w:ascii="Malgun Gothic" w:cs="Malgun Gothic" w:eastAsia="Malgun Gothic" w:hAnsi="Malgun Gothic"/>
-          <w:sz w:val="22"/>
-          <w:szCs w:val="22"/>
-        </w:rPr>
-        <w:t xml:space="preserve">관리자 화면 위쪽 메뉴에서 [🖥 학생 입출입] 탭을 클릭합니다.</w:t>
-      </w:r>
-    </w:p>
-    <w:p>
-      <w:pPr>
-        <w:pStyle w:val="ListParagraph"/>
-        <w:numPr>
-          <w:ilvl w:val="0"/>
-          <w:numId w:val="2"/>
-        </w:numPr>
-        <w:spacing w:after="120" w:line="300"/>
-      </w:pPr>
-      <w:r>
-        <w:rPr>
-          <w:rFonts w:ascii="Malgun Gothic" w:cs="Malgun Gothic" w:eastAsia="Malgun Gothic" w:hAnsi="Malgun Gothic"/>
-          <w:sz w:val="22"/>
-          <w:szCs w:val="22"/>
-        </w:rPr>
-        <w:t xml:space="preserve">이 화면이 나온 상태로 태블릿을 독서실 입구 등에 고정해 둡니다.</w:t>
-      </w:r>
-    </w:p>
-    <w:p>
-      <w:pPr>
-        <w:pStyle w:val="ListParagraph"/>
-        <w:numPr>
-          <w:ilvl w:val="0"/>
-          <w:numId w:val="2"/>
-        </w:numPr>
-        <w:spacing w:after="120" w:line="300"/>
-      </w:pPr>
-      <w:r>
-        <w:rPr>
-          <w:rFonts w:ascii="Malgun Gothic" w:cs="Malgun Gothic" w:eastAsia="Malgun Gothic" w:hAnsi="Malgun Gothic"/>
-          <w:sz w:val="22"/>
-          <w:szCs w:val="22"/>
-        </w:rPr>
-        <w:t xml:space="preserve">학생은 본인의 4자리 번호(휴대폰 뒷자리 4자리)를 입력해 본인을 확인합니다.</w:t>
-      </w:r>
-    </w:p>
-    <w:p>
-      <w:pPr>
-        <w:pStyle w:val="ListParagraph"/>
-        <w:numPr>
-          <w:ilvl w:val="0"/>
-          <w:numId w:val="2"/>
-        </w:numPr>
-        <w:spacing w:after="120" w:line="300"/>
-      </w:pPr>
-      <w:r>
-        <w:rPr>
-          <w:rFonts w:ascii="Malgun Gothic" w:cs="Malgun Gothic" w:eastAsia="Malgun Gothic" w:hAnsi="Malgun Gothic"/>
-          <w:sz w:val="22"/>
-          <w:szCs w:val="22"/>
-        </w:rPr>
-        <w:t xml:space="preserve">빈 좌석 중 원하는 자리를 선택하면 출석(입실) 처리가 됩니다.</w:t>
-      </w:r>
-    </w:p>
-    <w:p>
-      <w:pPr>
-        <w:pStyle w:val="ListParagraph"/>
-        <w:numPr>
-          <w:ilvl w:val="0"/>
-          <w:numId w:val="2"/>
-        </w:numPr>
-        <w:spacing w:after="120" w:line="300"/>
-      </w:pPr>
-      <w:r>
-        <w:rPr>
-          <w:rFonts w:ascii="Malgun Gothic" w:cs="Malgun Gothic" w:eastAsia="Malgun Gothic" w:hAnsi="Malgun Gothic"/>
-          <w:sz w:val="22"/>
-          <w:szCs w:val="22"/>
-        </w:rPr>
-        <w:t xml:space="preserve">독서실을 나갈 때도 같은 방법으로 다시 체크해 퇴실 처리를 합니다.</w:t>
+        <w:t xml:space="preserve">학생에게 전달한 링크를 열면, 학생 본인만의 학습 다이어리 화면이 나타납니다. 학생은 여기에 연간·월간·주간·일간 계획을 세우고, 오늘 할 일을 시간대별로 적고, 다 한 일은 체크리스트로 체크합니다.</w:t>
+      </w:r>
+    </w:p>
+    <w:p>
+      <w:pPr>
+        <w:spacing w:after="140" w:line="300"/>
+      </w:pPr>
+      <w:r>
+        <w:rPr>
+          <w:rFonts w:ascii="Malgun Gothic" w:cs="Malgun Gothic" w:eastAsia="Malgun Gothic" w:hAnsi="Malgun Gothic"/>
+          <w:sz w:val="22"/>
+          <w:szCs w:val="22"/>
+        </w:rPr>
+        <w:t xml:space="preserve">중요한 점: 원장님이 나중에 확인하는 일간·주간·월간 리포트는 이 학생 다이어리에 학생이 직접 적어 넣은 내용(오늘의 계획, 체크리스트 완료 여부)과 태블릿으로 기록된 출석·공부시간을 합쳐서 만들어집니다. 즉, 학생이 다이어리를 성실히 쓸수록 리포트 내용도 풍부해집니다.</w:t>
       </w:r>
     </w:p>
     <w:tbl>
@@ -1715,6 +1587,432 @@
           <w:tcPr>
             <w:tcW w:type="dxa" w:w="9000"/>
             <w:tcBorders>
+              <w:top w:val="single" w:color="E08787" w:sz="8"/>
+              <w:left w:val="single" w:color="E08787" w:sz="8"/>
+              <w:bottom w:val="single" w:color="E08787" w:sz="8"/>
+              <w:right w:val="single" w:color="E08787" w:sz="8"/>
+            </w:tcBorders>
+            <w:shd w:fill="FDE8E8" w:color="auto" w:val="clear"/>
+            <w:tcMar>
+              <w:top w:type="dxa" w:w="140"/>
+              <w:left w:type="dxa" w:w="180"/>
+              <w:bottom w:type="dxa" w:w="140"/>
+              <w:right w:type="dxa" w:w="180"/>
+            </w:tcMar>
+          </w:tcPr>
+          <w:p>
+            <w:pPr>
+              <w:spacing w:after="60"/>
+            </w:pPr>
+            <w:r>
+              <w:rPr>
+                <w:rFonts w:ascii="Malgun Gothic" w:cs="Malgun Gothic" w:eastAsia="Malgun Gothic" w:hAnsi="Malgun Gothic"/>
+                <w:b/>
+                <w:bCs/>
+                <w:color w:val="1F3B57"/>
+                <w:sz w:val="21"/>
+                <w:szCs w:val="21"/>
+              </w:rPr>
+              <w:t xml:space="preserve">⚠️ 주의 — 학생이 다이어리를 안 쓰면 리포트가 비어 보여요</w:t>
+            </w:r>
+          </w:p>
+          <w:p>
+            <w:pPr>
+              <w:spacing w:line="280"/>
+            </w:pPr>
+            <w:r>
+              <w:rPr>
+                <w:rFonts w:ascii="Malgun Gothic" w:cs="Malgun Gothic" w:eastAsia="Malgun Gothic" w:hAnsi="Malgun Gothic"/>
+                <w:sz w:val="21"/>
+                <w:szCs w:val="21"/>
+              </w:rPr>
+              <w:t xml:space="preserve">학생이 출석은 했지만 본인 다이어리에 계획을 적지 않으면, 리포트의 '총 계획 시간'이나 '체크리스트 달성률' 항목은 0으로 나옵니다(출석·공부시간 기록은 정상적으로 나옵니다). 링크를 전달할 때 학생에게 매일 다이어리에 오늘 할 일을 적고 체크하도록 꼭 안내해 주세요.</w:t>
+            </w:r>
+          </w:p>
+        </w:tc>
+      </w:tr>
+    </w:tbl>
+    <w:p>
+      <w:pPr>
+        <w:spacing w:after="160"/>
+      </w:pPr>
+    </w:p>
+    <w:p>
+      <w:pPr>
+        <w:spacing w:after="140" w:line="300"/>
+      </w:pPr>
+      <w:r>
+        <w:rPr>
+          <w:rFonts w:ascii="Malgun Gothic" w:cs="Malgun Gothic" w:eastAsia="Malgun Gothic" w:hAnsi="Malgun Gothic"/>
+          <w:sz w:val="22"/>
+          <w:szCs w:val="22"/>
+        </w:rPr>
+        <w:t xml:space="preserve">원장님도 학생이 쓴 내용을 바탕으로 만들어진 리포트를 직접 볼 수 있습니다. [학생관리] 목록에서 학생 이름 옆의 [📊 리포트] 버튼을 누르면 그 학생의 일간·주간·월간 리포트가 새 창으로 열립니다. 같은 리포트 화면은 학생·학부모에게 공유한 링크로도 똑같이 확인할 수 있고, 설정에서 켜두면 매주 금요일 저녁에 학부모에게 주간 리포트가 자동으로 전송됩니다.</w:t>
+      </w:r>
+    </w:p>
+    <w:p>
+      <w:r>
+        <w:br w:type="page"/>
+      </w:r>
+    </w:p>
+    <w:p>
+      <w:pPr>
+        <w:pStyle w:val="Heading1"/>
+        <w:pBdr>
+          <w:bottom w:val="single" w:color="1F3B57" w:sz="12" w:space="4"/>
+        </w:pBdr>
+        <w:spacing w:after="200" w:before="480"/>
+      </w:pPr>
+      <w:r>
+        <w:rPr>
+          <w:rFonts w:ascii="Malgun Gothic" w:cs="Malgun Gothic" w:eastAsia="Malgun Gothic" w:hAnsi="Malgun Gothic"/>
+          <w:b/>
+          <w:bCs/>
+          <w:color w:val="2E6BB4"/>
+          <w:sz w:val="30"/>
+          <w:szCs w:val="30"/>
+        </w:rPr>
+        <w:t xml:space="preserve">3단계.  </w:t>
+      </w:r>
+      <w:r>
+        <w:rPr>
+          <w:rFonts w:ascii="Malgun Gothic" w:cs="Malgun Gothic" w:eastAsia="Malgun Gothic" w:hAnsi="Malgun Gothic"/>
+          <w:b/>
+          <w:bCs/>
+          <w:color w:val="1F3B57"/>
+          <w:sz w:val="30"/>
+          <w:szCs w:val="30"/>
+        </w:rPr>
+        <w:t xml:space="preserve">기본 설정 확인하기</w:t>
+      </w:r>
+    </w:p>
+    <w:p>
+      <w:pPr>
+        <w:spacing w:after="140" w:line="300"/>
+      </w:pPr>
+      <w:r>
+        <w:rPr>
+          <w:rFonts w:ascii="Malgun Gothic" w:cs="Malgun Gothic" w:eastAsia="Malgun Gothic" w:hAnsi="Malgun Gothic"/>
+          <w:sz w:val="22"/>
+          <w:szCs w:val="22"/>
+        </w:rPr>
+        <w:t xml:space="preserve">[설정] 탭에서 학원의 기본 운영 방식을 정합니다. 한 번만 정해두면 계속 유지됩니다.</w:t>
+      </w:r>
+    </w:p>
+    <w:p>
+      <w:pPr>
+        <w:pStyle w:val="ListParagraph"/>
+        <w:numPr>
+          <w:ilvl w:val="0"/>
+          <w:numId w:val="2"/>
+        </w:numPr>
+        <w:spacing w:after="120" w:line="300"/>
+      </w:pPr>
+      <w:r>
+        <w:rPr>
+          <w:rFonts w:ascii="Malgun Gothic" w:cs="Malgun Gothic" w:eastAsia="Malgun Gothic" w:hAnsi="Malgun Gothic"/>
+          <w:sz w:val="22"/>
+          <w:szCs w:val="22"/>
+        </w:rPr>
+        <w:t xml:space="preserve">위쪽 메뉴에서 [설정] 탭을 클릭합니다.</w:t>
+      </w:r>
+    </w:p>
+    <w:p>
+      <w:pPr>
+        <w:pStyle w:val="ListParagraph"/>
+        <w:numPr>
+          <w:ilvl w:val="0"/>
+          <w:numId w:val="2"/>
+        </w:numPr>
+        <w:spacing w:after="120" w:line="300"/>
+      </w:pPr>
+      <w:r>
+        <w:rPr>
+          <w:rFonts w:ascii="Malgun Gothic" w:cs="Malgun Gothic" w:eastAsia="Malgun Gothic" w:hAnsi="Malgun Gothic"/>
+          <w:sz w:val="22"/>
+          <w:szCs w:val="22"/>
+        </w:rPr>
+        <w:t xml:space="preserve">학원(독서실) 이름을 입력하거나 확인합니다.</w:t>
+      </w:r>
+    </w:p>
+    <w:p>
+      <w:pPr>
+        <w:pStyle w:val="ListParagraph"/>
+        <w:numPr>
+          <w:ilvl w:val="0"/>
+          <w:numId w:val="2"/>
+        </w:numPr>
+        <w:spacing w:after="120" w:line="300"/>
+      </w:pPr>
+      <w:r>
+        <w:rPr>
+          <w:rFonts w:ascii="Malgun Gothic" w:cs="Malgun Gothic" w:eastAsia="Malgun Gothic" w:hAnsi="Malgun Gothic"/>
+          <w:sz w:val="22"/>
+          <w:szCs w:val="22"/>
+        </w:rPr>
+        <w:t xml:space="preserve">자리 배정 방식을 정합니다. [자유석]은 학생이 빈자리 아무데나 앉는 방식이고, [지정자석]은 학생마다 고정된 자리를 정해주는 방식입니다. 처음에는 [자유석]을 추천합니다.</w:t>
+      </w:r>
+    </w:p>
+    <w:p>
+      <w:pPr>
+        <w:pStyle w:val="ListParagraph"/>
+        <w:numPr>
+          <w:ilvl w:val="0"/>
+          <w:numId w:val="2"/>
+        </w:numPr>
+        <w:spacing w:after="120" w:line="300"/>
+      </w:pPr>
+      <w:r>
+        <w:rPr>
+          <w:rFonts w:ascii="Malgun Gothic" w:cs="Malgun Gothic" w:eastAsia="Malgun Gothic" w:hAnsi="Malgun Gothic"/>
+          <w:sz w:val="22"/>
+          <w:szCs w:val="22"/>
+        </w:rPr>
+        <w:t xml:space="preserve">학부모 알림(카카오톡 또는 문자)을 사용하실 경우 관련 정보를 입력합니다. 필요 없으면 비워두어도 됩니다.</w:t>
+      </w:r>
+    </w:p>
+    <w:p>
+      <w:pPr>
+        <w:pStyle w:val="ListParagraph"/>
+        <w:numPr>
+          <w:ilvl w:val="0"/>
+          <w:numId w:val="2"/>
+        </w:numPr>
+        <w:spacing w:after="120" w:line="300"/>
+      </w:pPr>
+      <w:r>
+        <w:rPr>
+          <w:rFonts w:ascii="Malgun Gothic" w:cs="Malgun Gothic" w:eastAsia="Malgun Gothic" w:hAnsi="Malgun Gothic"/>
+          <w:sz w:val="22"/>
+          <w:szCs w:val="22"/>
+        </w:rPr>
+        <w:t xml:space="preserve">태블릿 종료용 4자리 비밀번호를 반드시 설정합니다.</w:t>
+      </w:r>
+    </w:p>
+    <w:tbl>
+      <w:tblPr>
+        <w:tblW w:type="dxa" w:w="9000"/>
+        <w:tblBorders>
+          <w:top w:val="single" w:color="auto" w:sz="4"/>
+          <w:left w:val="single" w:color="auto" w:sz="4"/>
+          <w:bottom w:val="single" w:color="auto" w:sz="4"/>
+          <w:right w:val="single" w:color="auto" w:sz="4"/>
+          <w:insideH w:val="single" w:color="auto" w:sz="4"/>
+          <w:insideV w:val="single" w:color="auto" w:sz="4"/>
+        </w:tblBorders>
+      </w:tblPr>
+      <w:tblGrid>
+        <w:gridCol w:w="9000"/>
+      </w:tblGrid>
+      <w:tr>
+        <w:tc>
+          <w:tcPr>
+            <w:tcW w:type="dxa" w:w="9000"/>
+            <w:tcBorders>
+              <w:top w:val="single" w:color="E08787" w:sz="8"/>
+              <w:left w:val="single" w:color="E08787" w:sz="8"/>
+              <w:bottom w:val="single" w:color="E08787" w:sz="8"/>
+              <w:right w:val="single" w:color="E08787" w:sz="8"/>
+            </w:tcBorders>
+            <w:shd w:fill="FDE8E8" w:color="auto" w:val="clear"/>
+            <w:tcMar>
+              <w:top w:type="dxa" w:w="140"/>
+              <w:left w:type="dxa" w:w="180"/>
+              <w:bottom w:type="dxa" w:w="140"/>
+              <w:right w:type="dxa" w:w="180"/>
+            </w:tcMar>
+          </w:tcPr>
+          <w:p>
+            <w:pPr>
+              <w:spacing w:after="60"/>
+            </w:pPr>
+            <w:r>
+              <w:rPr>
+                <w:rFonts w:ascii="Malgun Gothic" w:cs="Malgun Gothic" w:eastAsia="Malgun Gothic" w:hAnsi="Malgun Gothic"/>
+                <w:b/>
+                <w:bCs/>
+                <w:color w:val="1F3B57"/>
+                <w:sz w:val="21"/>
+                <w:szCs w:val="21"/>
+              </w:rPr>
+              <w:t xml:space="preserve">⚠️ 주의 — 태블릿 비밀번호를 꼭 설정하세요</w:t>
+            </w:r>
+          </w:p>
+          <w:p>
+            <w:pPr>
+              <w:spacing w:line="280"/>
+            </w:pPr>
+            <w:r>
+              <w:rPr>
+                <w:rFonts w:ascii="Malgun Gothic" w:cs="Malgun Gothic" w:eastAsia="Malgun Gothic" w:hAnsi="Malgun Gothic"/>
+                <w:sz w:val="21"/>
+                <w:szCs w:val="21"/>
+              </w:rPr>
+              <w:t xml:space="preserve">학생 출석 체크용 태블릿 화면은 학생들이 실수로 관리자 화면으로 넘어가지 못하도록 4자리 비밀번호로 잠겨 있습니다. 이 비밀번호를 미리 정해두지 않으면 나중에 태블릿에서 빠져나오기 곤란할 수 있으니, 꼭 기억하기 쉬운 번호로 설정해 두세요.</w:t>
+            </w:r>
+          </w:p>
+        </w:tc>
+      </w:tr>
+    </w:tbl>
+    <w:p>
+      <w:r>
+        <w:br w:type="page"/>
+      </w:r>
+    </w:p>
+    <w:p>
+      <w:pPr>
+        <w:pStyle w:val="Heading1"/>
+        <w:pBdr>
+          <w:bottom w:val="single" w:color="1F3B57" w:sz="12" w:space="4"/>
+        </w:pBdr>
+        <w:spacing w:after="200" w:before="480"/>
+      </w:pPr>
+      <w:r>
+        <w:rPr>
+          <w:rFonts w:ascii="Malgun Gothic" w:cs="Malgun Gothic" w:eastAsia="Malgun Gothic" w:hAnsi="Malgun Gothic"/>
+          <w:b/>
+          <w:bCs/>
+          <w:color w:val="2E6BB4"/>
+          <w:sz w:val="30"/>
+          <w:szCs w:val="30"/>
+        </w:rPr>
+        <w:t xml:space="preserve">4단계.  </w:t>
+      </w:r>
+      <w:r>
+        <w:rPr>
+          <w:rFonts w:ascii="Malgun Gothic" w:cs="Malgun Gothic" w:eastAsia="Malgun Gothic" w:hAnsi="Malgun Gothic"/>
+          <w:b/>
+          <w:bCs/>
+          <w:color w:val="1F3B57"/>
+          <w:sz w:val="30"/>
+          <w:szCs w:val="30"/>
+        </w:rPr>
+        <w:t xml:space="preserve">태블릿으로 학생 출석 체크하기</w:t>
+      </w:r>
+    </w:p>
+    <w:p>
+      <w:pPr>
+        <w:spacing w:after="140" w:line="300"/>
+      </w:pPr>
+      <w:r>
+        <w:rPr>
+          <w:rFonts w:ascii="Malgun Gothic" w:cs="Malgun Gothic" w:eastAsia="Malgun Gothic" w:hAnsi="Malgun Gothic"/>
+          <w:sz w:val="22"/>
+          <w:szCs w:val="22"/>
+        </w:rPr>
+        <w:t xml:space="preserve">독서실 입구나 책상에 놓아둘 태블릿(또는 여분 컴퓨터)에서 사용하는 화면입니다. 1~3단계를 먼저 마친 뒤에 사용해 주세요.</w:t>
+      </w:r>
+    </w:p>
+    <w:p>
+      <w:pPr>
+        <w:pStyle w:val="ListParagraph"/>
+        <w:numPr>
+          <w:ilvl w:val="0"/>
+          <w:numId w:val="2"/>
+        </w:numPr>
+        <w:spacing w:after="120" w:line="300"/>
+      </w:pPr>
+      <w:r>
+        <w:rPr>
+          <w:rFonts w:ascii="Malgun Gothic" w:cs="Malgun Gothic" w:eastAsia="Malgun Gothic" w:hAnsi="Malgun Gothic"/>
+          <w:sz w:val="22"/>
+          <w:szCs w:val="22"/>
+        </w:rPr>
+        <w:t xml:space="preserve">관리자 화면 위쪽 메뉴에서 [🖥 학생 입출입] 탭을 클릭합니다.</w:t>
+      </w:r>
+    </w:p>
+    <w:p>
+      <w:pPr>
+        <w:pStyle w:val="ListParagraph"/>
+        <w:numPr>
+          <w:ilvl w:val="0"/>
+          <w:numId w:val="2"/>
+        </w:numPr>
+        <w:spacing w:after="120" w:line="300"/>
+      </w:pPr>
+      <w:r>
+        <w:rPr>
+          <w:rFonts w:ascii="Malgun Gothic" w:cs="Malgun Gothic" w:eastAsia="Malgun Gothic" w:hAnsi="Malgun Gothic"/>
+          <w:sz w:val="22"/>
+          <w:szCs w:val="22"/>
+        </w:rPr>
+        <w:t xml:space="preserve">이 화면이 나온 상태로 태블릿을 독서실 입구 등에 고정해 둡니다.</w:t>
+      </w:r>
+    </w:p>
+    <w:p>
+      <w:pPr>
+        <w:pStyle w:val="ListParagraph"/>
+        <w:numPr>
+          <w:ilvl w:val="0"/>
+          <w:numId w:val="2"/>
+        </w:numPr>
+        <w:spacing w:after="120" w:line="300"/>
+      </w:pPr>
+      <w:r>
+        <w:rPr>
+          <w:rFonts w:ascii="Malgun Gothic" w:cs="Malgun Gothic" w:eastAsia="Malgun Gothic" w:hAnsi="Malgun Gothic"/>
+          <w:sz w:val="22"/>
+          <w:szCs w:val="22"/>
+        </w:rPr>
+        <w:t xml:space="preserve">학생은 본인의 4자리 번호(휴대폰 뒷자리 4자리)를 입력해 본인을 확인합니다.</w:t>
+      </w:r>
+    </w:p>
+    <w:p>
+      <w:pPr>
+        <w:pStyle w:val="ListParagraph"/>
+        <w:numPr>
+          <w:ilvl w:val="0"/>
+          <w:numId w:val="2"/>
+        </w:numPr>
+        <w:spacing w:after="120" w:line="300"/>
+      </w:pPr>
+      <w:r>
+        <w:rPr>
+          <w:rFonts w:ascii="Malgun Gothic" w:cs="Malgun Gothic" w:eastAsia="Malgun Gothic" w:hAnsi="Malgun Gothic"/>
+          <w:sz w:val="22"/>
+          <w:szCs w:val="22"/>
+        </w:rPr>
+        <w:t xml:space="preserve">빈 좌석 중 원하는 자리를 선택하면 출석(입실) 처리가 됩니다.</w:t>
+      </w:r>
+    </w:p>
+    <w:p>
+      <w:pPr>
+        <w:pStyle w:val="ListParagraph"/>
+        <w:numPr>
+          <w:ilvl w:val="0"/>
+          <w:numId w:val="2"/>
+        </w:numPr>
+        <w:spacing w:after="120" w:line="300"/>
+      </w:pPr>
+      <w:r>
+        <w:rPr>
+          <w:rFonts w:ascii="Malgun Gothic" w:cs="Malgun Gothic" w:eastAsia="Malgun Gothic" w:hAnsi="Malgun Gothic"/>
+          <w:sz w:val="22"/>
+          <w:szCs w:val="22"/>
+        </w:rPr>
+        <w:t xml:space="preserve">독서실을 나갈 때도 같은 방법으로 다시 체크해 퇴실 처리를 합니다.</w:t>
+      </w:r>
+    </w:p>
+    <w:tbl>
+      <w:tblPr>
+        <w:tblW w:type="dxa" w:w="9000"/>
+        <w:tblBorders>
+          <w:top w:val="single" w:color="auto" w:sz="4"/>
+          <w:left w:val="single" w:color="auto" w:sz="4"/>
+          <w:bottom w:val="single" w:color="auto" w:sz="4"/>
+          <w:right w:val="single" w:color="auto" w:sz="4"/>
+          <w:insideH w:val="single" w:color="auto" w:sz="4"/>
+          <w:insideV w:val="single" w:color="auto" w:sz="4"/>
+        </w:tblBorders>
+      </w:tblPr>
+      <w:tblGrid>
+        <w:gridCol w:w="9000"/>
+      </w:tblGrid>
+      <w:tr>
+        <w:tc>
+          <w:tcPr>
+            <w:tcW w:type="dxa" w:w="9000"/>
+            <w:tcBorders>
               <w:top w:val="single" w:color="E8C660" w:sz="8"/>
               <w:left w:val="single" w:color="E8C660" w:sz="8"/>
               <w:bottom w:val="single" w:color="E8C660" w:sz="8"/>
@@ -2101,6 +2399,57 @@
           <w:szCs w:val="21"/>
         </w:rPr>
         <w:t xml:space="preserve">[학생관리] 탭의 학생 목록에서 해당 학생을 찾아 링크를 다시 복사하거나 카카오톡으로 재전송하면 됩니다.</w:t>
+      </w:r>
+    </w:p>
+    <w:p>
+      <w:pPr>
+        <w:spacing w:after="60" w:before="160"/>
+      </w:pPr>
+      <w:r>
+        <w:rPr>
+          <w:rFonts w:ascii="Malgun Gothic" w:cs="Malgun Gothic" w:eastAsia="Malgun Gothic" w:hAnsi="Malgun Gothic"/>
+          <w:b/>
+          <w:bCs/>
+          <w:color w:val="2E6BB4"/>
+          <w:sz w:val="22"/>
+          <w:szCs w:val="22"/>
+        </w:rPr>
+        <w:t xml:space="preserve">Q. </w:t>
+      </w:r>
+      <w:r>
+        <w:rPr>
+          <w:rFonts w:ascii="Malgun Gothic" w:cs="Malgun Gothic" w:eastAsia="Malgun Gothic" w:hAnsi="Malgun Gothic"/>
+          <w:b/>
+          <w:bCs/>
+          <w:sz w:val="22"/>
+          <w:szCs w:val="22"/>
+        </w:rPr>
+        <w:t xml:space="preserve">리포트를 봤는데 '총 계획 시간'과 '체크리스트 달성률'이 0으로 나와요.</w:t>
+      </w:r>
+    </w:p>
+    <w:p>
+      <w:pPr>
+        <w:spacing w:after="60" w:line="280"/>
+        <w:ind w:left="260"/>
+      </w:pPr>
+      <w:r>
+        <w:rPr>
+          <w:rFonts w:ascii="Malgun Gothic" w:cs="Malgun Gothic" w:eastAsia="Malgun Gothic" w:hAnsi="Malgun Gothic"/>
+          <w:b/>
+          <w:bCs/>
+          <w:color w:val="1F3B57"/>
+          <w:sz w:val="21"/>
+          <w:szCs w:val="21"/>
+        </w:rPr>
+        <w:t xml:space="preserve">A. </w:t>
+      </w:r>
+      <w:r>
+        <w:rPr>
+          <w:rFonts w:ascii="Malgun Gothic" w:cs="Malgun Gothic" w:eastAsia="Malgun Gothic" w:hAnsi="Malgun Gothic"/>
+          <w:sz w:val="21"/>
+          <w:szCs w:val="21"/>
+        </w:rPr>
+        <w:t xml:space="preserve">출석 기록은 정상인데 이 항목만 0이라면, 학생이 본인 다이어리(링크)에 오늘 할 일을 적지 않은 것입니다. 학생에게 다이어리에 계획을 적고 체크하는 습관을 안내해 주세요.</w:t>
       </w:r>
     </w:p>
     <w:p>

</xml_diff>